<commit_message>
Added more details to the SRS
</commit_message>
<xml_diff>
--- a/SRS/Final SRS.docx
+++ b/SRS/Final SRS.docx
@@ -537,6 +537,34 @@
       </w:r>
     </w:p>
     <w:p>
+      <w:pPr>
+        <w:pStyle w:val="ListParagraph"/>
+        <w:numPr>
+          <w:ilvl w:val="0"/>
+          <w:numId w:val="8"/>
+        </w:numPr>
+      </w:pPr>
+      <w:r>
+        <w:t xml:space="preserve">The system </w:t>
+      </w:r>
+      <w:proofErr w:type="gramStart"/>
+      <w:r>
+        <w:t>shall</w:t>
+      </w:r>
+      <w:proofErr w:type="gramEnd"/>
+      <w:r>
+        <w:t xml:space="preserve"> detect and </w:t>
+      </w:r>
+      <w:proofErr w:type="gramStart"/>
+      <w:r>
+        <w:t>handle</w:t>
+      </w:r>
+      <w:proofErr w:type="gramEnd"/>
+      <w:r>
+        <w:t xml:space="preserve"> unavailable external APIs without crashing.</w:t>
+      </w:r>
+    </w:p>
+    <w:p>
       <w:r>
         <w:rPr>
           <w:b/>
@@ -606,6 +634,55 @@
       </w:r>
     </w:p>
     <w:p>
+      <w:pPr>
+        <w:pStyle w:val="ListParagraph"/>
+        <w:numPr>
+          <w:ilvl w:val="0"/>
+          <w:numId w:val="10"/>
+        </w:numPr>
+      </w:pPr>
+      <w:r>
+        <w:t xml:space="preserve">Loading states shall </w:t>
+      </w:r>
+      <w:proofErr w:type="gramStart"/>
+      <w:r>
+        <w:t>be displayed</w:t>
+      </w:r>
+      <w:proofErr w:type="gramEnd"/>
+      <w:r>
+        <w:t xml:space="preserve"> when data is </w:t>
+      </w:r>
+      <w:proofErr w:type="gramStart"/>
+      <w:r>
+        <w:t xml:space="preserve">being </w:t>
+      </w:r>
+      <w:r>
+        <w:t>fetched</w:t>
+      </w:r>
+      <w:proofErr w:type="gramEnd"/>
+      <w:r>
+        <w:t>.</w:t>
+      </w:r>
+    </w:p>
+    <w:p>
+      <w:pPr>
+        <w:pStyle w:val="ListParagraph"/>
+        <w:numPr>
+          <w:ilvl w:val="0"/>
+          <w:numId w:val="10"/>
+        </w:numPr>
+      </w:pPr>
+      <w:r>
+        <w:t xml:space="preserve">Error messages </w:t>
+      </w:r>
+      <w:r>
+        <w:t>should</w:t>
+      </w:r>
+      <w:r>
+        <w:t xml:space="preserve"> be user-friendly and actionable.</w:t>
+      </w:r>
+    </w:p>
+    <w:p>
       <w:r>
         <w:rPr>
           <w:b/>
@@ -651,6 +728,18 @@
       </w:r>
     </w:p>
     <w:p>
+      <w:pPr>
+        <w:pStyle w:val="ListParagraph"/>
+        <w:numPr>
+          <w:ilvl w:val="0"/>
+          <w:numId w:val="11"/>
+        </w:numPr>
+      </w:pPr>
+      <w:r>
+        <w:t>Sensitive configuration values shall not be hardcoded in the source code.</w:t>
+      </w:r>
+    </w:p>
+    <w:p>
       <w:r>
         <w:rPr>
           <w:b/>
@@ -788,6 +877,19 @@
       </w:r>
     </w:p>
     <w:p>
+      <w:pPr>
+        <w:pStyle w:val="ListParagraph"/>
+        <w:numPr>
+          <w:ilvl w:val="0"/>
+          <w:numId w:val="13"/>
+        </w:numPr>
+      </w:pPr>
+      <w:r>
+        <w:lastRenderedPageBreak/>
+        <w:t>The system shall follow consistent naming and coding standards.</w:t>
+      </w:r>
+    </w:p>
+    <w:p>
       <w:r>
         <w:rPr>
           <w:b/>
@@ -835,7 +937,6 @@
         </w:numPr>
       </w:pPr>
       <w:r>
-        <w:lastRenderedPageBreak/>
         <w:t xml:space="preserve">The interface </w:t>
       </w:r>
       <w:r>
@@ -844,6 +945,23 @@
       <w:r>
         <w:t xml:space="preserve"> to different screen sizes.</w:t>
       </w:r>
+    </w:p>
+    <w:p>
+      <w:pPr>
+        <w:pStyle w:val="ListParagraph"/>
+        <w:numPr>
+          <w:ilvl w:val="0"/>
+          <w:numId w:val="14"/>
+        </w:numPr>
+      </w:pPr>
+      <w:r>
+        <w:t xml:space="preserve">The system shall function without requiring browser-specific </w:t>
+      </w:r>
+      <w:proofErr w:type="gramStart"/>
+      <w:r>
+        <w:t>plugins</w:t>
+      </w:r>
+      <w:proofErr w:type="gramEnd"/>
     </w:p>
     <w:p>
       <w:r>
@@ -931,6 +1049,21 @@
       </w:r>
     </w:p>
     <w:p>
+      <w:pPr>
+        <w:pStyle w:val="ListParagraph"/>
+        <w:numPr>
+          <w:ilvl w:val="0"/>
+          <w:numId w:val="15"/>
+        </w:numPr>
+      </w:pPr>
+      <w:r>
+        <w:t xml:space="preserve">The system shall clearly indicate when displayed data may be </w:t>
+      </w:r>
+      <w:r>
+        <w:t>outdated.</w:t>
+      </w:r>
+    </w:p>
+    <w:p>
       <w:r>
         <w:rPr>
           <w:b/>
@@ -996,6 +1129,25 @@
       </w:r>
     </w:p>
     <w:p>
+      <w:pPr>
+        <w:pStyle w:val="ListParagraph"/>
+        <w:numPr>
+          <w:ilvl w:val="0"/>
+          <w:numId w:val="16"/>
+        </w:numPr>
+      </w:pPr>
+      <w:r>
+        <w:t>Interactive elements shall include descriptive labels or ARIA attributes</w:t>
+      </w:r>
+      <w:r>
+        <w:rPr>
+          <w:b/>
+          <w:bCs/>
+        </w:rPr>
+        <w:t>.</w:t>
+      </w:r>
+    </w:p>
+    <w:p>
       <w:r>
         <w:rPr>
           <w:b/>
@@ -1077,6 +1229,18 @@
       </w:r>
     </w:p>
     <w:p>
+      <w:pPr>
+        <w:pStyle w:val="ListParagraph"/>
+        <w:numPr>
+          <w:ilvl w:val="0"/>
+          <w:numId w:val="17"/>
+        </w:numPr>
+      </w:pPr>
+      <w:r>
+        <w:t>Logs shall include timestamps and severity levels.</w:t>
+      </w:r>
+    </w:p>
+    <w:p>
       <w:r>
         <w:rPr>
           <w:b/>
@@ -1138,6 +1302,26 @@
       </w:r>
     </w:p>
     <w:p>
+      <w:pPr>
+        <w:pStyle w:val="ListParagraph"/>
+        <w:numPr>
+          <w:ilvl w:val="0"/>
+          <w:numId w:val="18"/>
+        </w:numPr>
+      </w:pPr>
+      <w:r>
+        <w:t xml:space="preserve">Backup data shall </w:t>
+      </w:r>
+      <w:proofErr w:type="gramStart"/>
+      <w:r>
+        <w:t>be stored</w:t>
+      </w:r>
+      <w:proofErr w:type="gramEnd"/>
+      <w:r>
+        <w:t xml:space="preserve"> securely.</w:t>
+      </w:r>
+    </w:p>
+    <w:p>
       <w:r>
         <w:rPr>
           <w:b/>
@@ -1186,6 +1370,7 @@
         </w:numPr>
       </w:pPr>
       <w:r>
+        <w:lastRenderedPageBreak/>
         <w:t xml:space="preserve">User privacy shall </w:t>
       </w:r>
       <w:proofErr w:type="gramStart"/>
@@ -1215,6 +1400,40 @@
       <w:proofErr w:type="gramEnd"/>
       <w:r>
         <w:t>.</w:t>
+      </w:r>
+    </w:p>
+    <w:p>
+      <w:pPr>
+        <w:pStyle w:val="NormalWeb"/>
+        <w:numPr>
+          <w:ilvl w:val="0"/>
+          <w:numId w:val="19"/>
+        </w:numPr>
+        <w:shd w:val="clear" w:color="auto" w:fill="FFFFFF"/>
+        <w:spacing w:before="0" w:beforeAutospacing="0" w:after="0" w:afterAutospacing="0"/>
+        <w:rPr>
+          <w:color w:val="000000"/>
+          <w:sz w:val="27"/>
+          <w:szCs w:val="27"/>
+        </w:rPr>
+      </w:pPr>
+      <w:r>
+        <w:rPr>
+          <w:rFonts w:ascii="Arial" w:hAnsi="Arial" w:cs="Arial"/>
+          <w:color w:val="000000"/>
+          <w:sz w:val="22"/>
+          <w:szCs w:val="22"/>
+        </w:rPr>
+        <w:t>The system shall not store personally identifiable information without user consent.</w:t>
+      </w:r>
+      <w:r>
+        <w:rPr>
+          <w:rFonts w:ascii="Arial" w:hAnsi="Arial" w:cs="Arial"/>
+          <w:color w:val="000000"/>
+          <w:sz w:val="22"/>
+          <w:szCs w:val="22"/>
+        </w:rPr>
+        <w:br/>
       </w:r>
     </w:p>
     <w:sectPr>
@@ -4402,7 +4621,6 @@
   <w:style w:type="character" w:default="1" w:styleId="DefaultParagraphFont">
     <w:name w:val="Default Paragraph Font"/>
     <w:uiPriority w:val="1"/>
-    <w:semiHidden/>
     <w:unhideWhenUsed/>
   </w:style>
   <w:style w:type="table" w:default="1" w:styleId="TableNormal">
@@ -4714,6 +4932,21 @@
       <w:smallCaps/>
       <w:color w:val="0F4761" w:themeColor="accent1" w:themeShade="BF"/>
       <w:spacing w:val="5"/>
+    </w:rPr>
+  </w:style>
+  <w:style w:type="paragraph" w:styleId="NormalWeb">
+    <w:name w:val="Normal (Web)"/>
+    <w:basedOn w:val="Normal"/>
+    <w:uiPriority w:val="99"/>
+    <w:unhideWhenUsed/>
+    <w:rsid w:val="00267231"/>
+    <w:pPr>
+      <w:spacing w:before="100" w:beforeAutospacing="1" w:after="100" w:afterAutospacing="1" w:line="240" w:lineRule="auto"/>
+    </w:pPr>
+    <w:rPr>
+      <w:rFonts w:ascii="Times New Roman" w:eastAsia="Times New Roman" w:hAnsi="Times New Roman" w:cs="Times New Roman"/>
+      <w:kern w:val="0"/>
+      <w14:ligatures w14:val="none"/>
     </w:rPr>
   </w:style>
 </w:styles>

</xml_diff>